<commit_message>
fix: reorganize structure - Lab1 and Lab3 in separate folders
</commit_message>
<xml_diff>
--- a/Lab1/Лаб1_Витрикуш_ІП-22-4.docx
+++ b/Lab1/Лаб1_Витрикуш_ІП-22-4.docx
@@ -1341,15 +1341,7 @@
           <w:sz w:val="28"/>
           <w:szCs w:val="28"/>
         </w:rPr>
-        <w:t xml:space="preserve">В завданні потрібно встановити </w:t>
-      </w:r>
-      <w:r>
-        <w:rPr>
-          <w:rFonts w:ascii="Times New Roman" w:hAnsi="Times New Roman" w:cs="Times New Roman"/>
-          <w:sz w:val="28"/>
-          <w:szCs w:val="28"/>
-        </w:rPr>
-        <w:t xml:space="preserve">VS </w:t>
+        <w:t xml:space="preserve">В завданні потрібно встановити VS </w:t>
       </w:r>
       <w:proofErr w:type="spellStart"/>
       <w:r>
@@ -1395,6 +1387,7 @@
           <w:rFonts w:ascii="Times New Roman" w:hAnsi="Times New Roman" w:cs="Times New Roman"/>
           <w:b/>
           <w:bCs/>
+          <w:noProof/>
           <w:sz w:val="28"/>
           <w:szCs w:val="28"/>
         </w:rPr>
@@ -1593,6 +1586,7 @@
       <w:r>
         <w:rPr>
           <w:rFonts w:ascii="Times New Roman" w:hAnsi="Times New Roman" w:cs="Times New Roman"/>
+          <w:noProof/>
           <w:sz w:val="20"/>
           <w:szCs w:val="20"/>
         </w:rPr>
@@ -1649,23 +1643,7 @@
           <w:sz w:val="20"/>
           <w:szCs w:val="20"/>
         </w:rPr>
-        <w:t xml:space="preserve">Рис. </w:t>
-      </w:r>
-      <w:r>
-        <w:rPr>
-          <w:rFonts w:ascii="Times New Roman" w:hAnsi="Times New Roman" w:cs="Times New Roman"/>
-          <w:sz w:val="20"/>
-          <w:szCs w:val="20"/>
-        </w:rPr>
-        <w:t>2</w:t>
-      </w:r>
-      <w:r>
-        <w:rPr>
-          <w:rFonts w:ascii="Times New Roman" w:hAnsi="Times New Roman" w:cs="Times New Roman"/>
-          <w:sz w:val="20"/>
-          <w:szCs w:val="20"/>
-        </w:rPr>
-        <w:t xml:space="preserve">. </w:t>
+        <w:t xml:space="preserve">Рис. 2. </w:t>
       </w:r>
       <w:r>
         <w:rPr>
@@ -1764,31 +1742,7 @@
           <w:sz w:val="28"/>
           <w:szCs w:val="28"/>
         </w:rPr>
-        <w:t>Тепер с</w:t>
-      </w:r>
-      <w:r>
-        <w:rPr>
-          <w:rFonts w:ascii="Times New Roman" w:hAnsi="Times New Roman" w:cs="Times New Roman"/>
-          <w:sz w:val="28"/>
-          <w:szCs w:val="28"/>
-        </w:rPr>
-        <w:t>твор</w:t>
-      </w:r>
-      <w:r>
-        <w:rPr>
-          <w:rFonts w:ascii="Times New Roman" w:hAnsi="Times New Roman" w:cs="Times New Roman"/>
-          <w:sz w:val="28"/>
-          <w:szCs w:val="28"/>
-        </w:rPr>
-        <w:t>юємо</w:t>
-      </w:r>
-      <w:r>
-        <w:rPr>
-          <w:rFonts w:ascii="Times New Roman" w:hAnsi="Times New Roman" w:cs="Times New Roman"/>
-          <w:sz w:val="28"/>
-          <w:szCs w:val="28"/>
-        </w:rPr>
-        <w:t xml:space="preserve"> у папці </w:t>
+        <w:t xml:space="preserve">Тепер створюємо у папці </w:t>
       </w:r>
       <w:proofErr w:type="spellStart"/>
       <w:r>
@@ -1822,6 +1776,7 @@
       <w:r>
         <w:rPr>
           <w:rFonts w:ascii="Times New Roman" w:hAnsi="Times New Roman" w:cs="Times New Roman"/>
+          <w:noProof/>
           <w:sz w:val="28"/>
           <w:szCs w:val="28"/>
         </w:rPr>
@@ -1985,6 +1940,7 @@
       <w:r>
         <w:rPr>
           <w:rFonts w:ascii="Times New Roman" w:hAnsi="Times New Roman" w:cs="Times New Roman"/>
+          <w:noProof/>
           <w:sz w:val="28"/>
           <w:szCs w:val="28"/>
           <w:lang w:val="en-US"/>
@@ -2164,6 +2120,7 @@
       <w:r>
         <w:rPr>
           <w:rFonts w:ascii="Times New Roman" w:hAnsi="Times New Roman" w:cs="Times New Roman"/>
+          <w:noProof/>
           <w:sz w:val="20"/>
           <w:szCs w:val="20"/>
         </w:rPr>
@@ -2221,15 +2178,7 @@
           <w:sz w:val="20"/>
           <w:szCs w:val="20"/>
         </w:rPr>
-        <w:t xml:space="preserve">Рис. </w:t>
-      </w:r>
-      <w:r>
-        <w:rPr>
-          <w:rFonts w:ascii="Times New Roman" w:hAnsi="Times New Roman" w:cs="Times New Roman"/>
-          <w:sz w:val="20"/>
-          <w:szCs w:val="20"/>
-        </w:rPr>
-        <w:t>5</w:t>
+        <w:t>Рис. 5</w:t>
       </w:r>
       <w:r>
         <w:rPr>
@@ -2311,15 +2260,7 @@
           <w:sz w:val="28"/>
           <w:szCs w:val="28"/>
         </w:rPr>
-        <w:t xml:space="preserve"> </w:t>
-      </w:r>
-      <w:r>
-        <w:rPr>
-          <w:rFonts w:ascii="Times New Roman" w:hAnsi="Times New Roman" w:cs="Times New Roman"/>
-          <w:sz w:val="28"/>
-          <w:szCs w:val="28"/>
-        </w:rPr>
-        <w:t xml:space="preserve">через консоль командою </w:t>
+        <w:t xml:space="preserve"> через консоль командою </w:t>
       </w:r>
     </w:p>
     <w:p>
@@ -2335,6 +2276,7 @@
       <w:r>
         <w:rPr>
           <w:rFonts w:ascii="Times New Roman" w:hAnsi="Times New Roman" w:cs="Times New Roman"/>
+          <w:noProof/>
           <w:sz w:val="20"/>
           <w:szCs w:val="20"/>
         </w:rPr>
@@ -2415,15 +2357,7 @@
           <w:sz w:val="20"/>
           <w:szCs w:val="20"/>
         </w:rPr>
-        <w:t>Результат виконання файлу</w:t>
-      </w:r>
-      <w:r>
-        <w:rPr>
-          <w:rFonts w:ascii="Times New Roman" w:hAnsi="Times New Roman" w:cs="Times New Roman"/>
-          <w:sz w:val="20"/>
-          <w:szCs w:val="20"/>
-        </w:rPr>
-        <w:t xml:space="preserve"> в консолі</w:t>
+        <w:t>Результат виконання файлу в консолі</w:t>
       </w:r>
     </w:p>
     <w:p>
@@ -2477,8 +2411,20 @@
           <w:sz w:val="28"/>
           <w:szCs w:val="28"/>
         </w:rPr>
-        <w:t xml:space="preserve"> та GitHub</w:t>
-      </w:r>
+        <w:t xml:space="preserve"> та </w:t>
+      </w:r>
+      <w:proofErr w:type="spellStart"/>
+      <w:r>
+        <w:rPr>
+          <w:rFonts w:ascii="Times New Roman" w:hAnsi="Times New Roman" w:cs="Times New Roman"/>
+          <w:b/>
+          <w:bCs/>
+          <w:sz w:val="28"/>
+          <w:szCs w:val="28"/>
+        </w:rPr>
+        <w:t>GitHub</w:t>
+      </w:r>
+      <w:proofErr w:type="spellEnd"/>
     </w:p>
     <w:p>
       <w:pPr>
@@ -2614,6 +2560,7 @@
       </w:pPr>
       <w:r>
         <w:rPr>
+          <w:noProof/>
           <w:sz w:val="28"/>
           <w:szCs w:val="28"/>
         </w:rPr>
@@ -2670,15 +2617,7 @@
           <w:sz w:val="20"/>
           <w:szCs w:val="20"/>
         </w:rPr>
-        <w:t xml:space="preserve">Рис. </w:t>
-      </w:r>
-      <w:r>
-        <w:rPr>
-          <w:rFonts w:ascii="Times New Roman" w:hAnsi="Times New Roman" w:cs="Times New Roman"/>
-          <w:sz w:val="20"/>
-          <w:szCs w:val="20"/>
-        </w:rPr>
-        <w:t>7</w:t>
+        <w:t>Рис. 7</w:t>
       </w:r>
       <w:r>
         <w:rPr>
@@ -2885,6 +2824,7 @@
       </w:pPr>
       <w:r>
         <w:rPr>
+          <w:noProof/>
           <w:sz w:val="28"/>
           <w:szCs w:val="28"/>
         </w:rPr>
@@ -2948,15 +2888,7 @@
           <w:sz w:val="20"/>
           <w:szCs w:val="20"/>
         </w:rPr>
-        <w:t xml:space="preserve">Рис. </w:t>
-      </w:r>
-      <w:r>
-        <w:rPr>
-          <w:rFonts w:ascii="Times New Roman" w:hAnsi="Times New Roman" w:cs="Times New Roman"/>
-          <w:sz w:val="20"/>
-          <w:szCs w:val="20"/>
-        </w:rPr>
-        <w:t>8</w:t>
+        <w:t>Рис. 8</w:t>
       </w:r>
       <w:r>
         <w:rPr>
@@ -3191,6 +3123,7 @@
       </w:pPr>
       <w:r>
         <w:rPr>
+          <w:noProof/>
           <w:sz w:val="28"/>
           <w:szCs w:val="28"/>
         </w:rPr>
@@ -3247,15 +3180,7 @@
           <w:sz w:val="20"/>
           <w:szCs w:val="20"/>
         </w:rPr>
-        <w:t xml:space="preserve">Рис. </w:t>
-      </w:r>
-      <w:r>
-        <w:rPr>
-          <w:rFonts w:ascii="Times New Roman" w:hAnsi="Times New Roman" w:cs="Times New Roman"/>
-          <w:sz w:val="20"/>
-          <w:szCs w:val="20"/>
-        </w:rPr>
-        <w:t>9</w:t>
+        <w:t>Рис. 9</w:t>
       </w:r>
       <w:r>
         <w:rPr>
@@ -3425,6 +3350,7 @@
       </w:pPr>
       <w:r>
         <w:rPr>
+          <w:noProof/>
           <w:sz w:val="28"/>
           <w:szCs w:val="28"/>
         </w:rPr>
@@ -3488,15 +3414,7 @@
           <w:sz w:val="20"/>
           <w:szCs w:val="20"/>
         </w:rPr>
-        <w:t xml:space="preserve">Рис. </w:t>
-      </w:r>
-      <w:r>
-        <w:rPr>
-          <w:rFonts w:ascii="Times New Roman" w:hAnsi="Times New Roman" w:cs="Times New Roman"/>
-          <w:sz w:val="20"/>
-          <w:szCs w:val="20"/>
-        </w:rPr>
-        <w:t xml:space="preserve">10. </w:t>
+        <w:t xml:space="preserve">Рис. 10. </w:t>
       </w:r>
       <w:r>
         <w:rPr>
@@ -3650,6 +3568,7 @@
       <w:r>
         <w:rPr>
           <w:rFonts w:ascii="Times New Roman" w:hAnsi="Times New Roman" w:cs="Times New Roman"/>
+          <w:noProof/>
           <w:sz w:val="28"/>
           <w:szCs w:val="28"/>
         </w:rPr>
@@ -3713,15 +3632,7 @@
           <w:sz w:val="20"/>
           <w:szCs w:val="20"/>
         </w:rPr>
-        <w:t>Рис. 1</w:t>
-      </w:r>
-      <w:r>
-        <w:rPr>
-          <w:rFonts w:ascii="Times New Roman" w:hAnsi="Times New Roman" w:cs="Times New Roman"/>
-          <w:sz w:val="20"/>
-          <w:szCs w:val="20"/>
-        </w:rPr>
-        <w:t>1.</w:t>
+        <w:t>Рис. 11.</w:t>
       </w:r>
       <w:r>
         <w:t xml:space="preserve"> </w:t>
@@ -3870,6 +3781,7 @@
       <w:r>
         <w:rPr>
           <w:rFonts w:ascii="Times New Roman" w:hAnsi="Times New Roman" w:cs="Times New Roman"/>
+          <w:noProof/>
           <w:sz w:val="28"/>
           <w:szCs w:val="28"/>
         </w:rPr>
@@ -3933,15 +3845,7 @@
           <w:sz w:val="20"/>
           <w:szCs w:val="20"/>
         </w:rPr>
-        <w:t>Рис. 1</w:t>
-      </w:r>
-      <w:r>
-        <w:rPr>
-          <w:rFonts w:ascii="Times New Roman" w:hAnsi="Times New Roman" w:cs="Times New Roman"/>
-          <w:sz w:val="20"/>
-          <w:szCs w:val="20"/>
-        </w:rPr>
-        <w:t>2.</w:t>
+        <w:t>Рис. 12.</w:t>
       </w:r>
       <w:r>
         <w:rPr>
@@ -4099,6 +4003,7 @@
       <w:r>
         <w:rPr>
           <w:rFonts w:ascii="Times New Roman" w:hAnsi="Times New Roman" w:cs="Times New Roman"/>
+          <w:noProof/>
           <w:sz w:val="28"/>
           <w:szCs w:val="28"/>
         </w:rPr>
@@ -4162,15 +4067,7 @@
           <w:sz w:val="20"/>
           <w:szCs w:val="20"/>
         </w:rPr>
-        <w:t>Рис. 1</w:t>
-      </w:r>
-      <w:r>
-        <w:rPr>
-          <w:rFonts w:ascii="Times New Roman" w:hAnsi="Times New Roman" w:cs="Times New Roman"/>
-          <w:sz w:val="20"/>
-          <w:szCs w:val="20"/>
-        </w:rPr>
-        <w:t>3.</w:t>
+        <w:t>Рис. 13.</w:t>
       </w:r>
       <w:r>
         <w:rPr>
@@ -4601,6 +4498,7 @@
       <w:r>
         <w:rPr>
           <w:rFonts w:ascii="Times New Roman" w:hAnsi="Times New Roman" w:cs="Times New Roman"/>
+          <w:noProof/>
           <w:sz w:val="28"/>
           <w:szCs w:val="28"/>
         </w:rPr>
@@ -4664,23 +4562,7 @@
           <w:sz w:val="20"/>
           <w:szCs w:val="20"/>
         </w:rPr>
-        <w:t>Рис. 1</w:t>
-      </w:r>
-      <w:r>
-        <w:rPr>
-          <w:rFonts w:ascii="Times New Roman" w:hAnsi="Times New Roman" w:cs="Times New Roman"/>
-          <w:sz w:val="20"/>
-          <w:szCs w:val="20"/>
-        </w:rPr>
-        <w:t>4</w:t>
-      </w:r>
-      <w:r>
-        <w:rPr>
-          <w:rFonts w:ascii="Times New Roman" w:hAnsi="Times New Roman" w:cs="Times New Roman"/>
-          <w:sz w:val="20"/>
-          <w:szCs w:val="20"/>
-        </w:rPr>
-        <w:t xml:space="preserve">. </w:t>
+        <w:t xml:space="preserve">Рис. 14. </w:t>
       </w:r>
       <w:r>
         <w:rPr>
@@ -4862,6 +4744,7 @@
       <w:r>
         <w:rPr>
           <w:rFonts w:ascii="Times New Roman" w:hAnsi="Times New Roman" w:cs="Times New Roman"/>
+          <w:noProof/>
           <w:sz w:val="28"/>
           <w:szCs w:val="28"/>
         </w:rPr>
@@ -4918,15 +4801,7 @@
           <w:sz w:val="20"/>
           <w:szCs w:val="20"/>
         </w:rPr>
-        <w:t>Рис. 1</w:t>
-      </w:r>
-      <w:r>
-        <w:rPr>
-          <w:rFonts w:ascii="Times New Roman" w:hAnsi="Times New Roman" w:cs="Times New Roman"/>
-          <w:sz w:val="20"/>
-          <w:szCs w:val="20"/>
-        </w:rPr>
-        <w:t>5.</w:t>
+        <w:t>Рис. 15.</w:t>
       </w:r>
       <w:r>
         <w:t xml:space="preserve"> </w:t>
@@ -4978,6 +4853,74 @@
           <w:szCs w:val="20"/>
         </w:rPr>
       </w:pPr>
+    </w:p>
+    <w:p>
+      <w:pPr>
+        <w:spacing w:after="0" w:line="360" w:lineRule="auto"/>
+        <w:rPr>
+          <w:rFonts w:ascii="Times New Roman" w:hAnsi="Times New Roman" w:cs="Times New Roman"/>
+          <w:b/>
+          <w:bCs/>
+          <w:sz w:val="28"/>
+          <w:szCs w:val="28"/>
+          <w:lang w:val="en-US"/>
+        </w:rPr>
+      </w:pPr>
+      <w:r>
+        <w:rPr>
+          <w:rFonts w:ascii="Times New Roman" w:hAnsi="Times New Roman" w:cs="Times New Roman"/>
+          <w:b/>
+          <w:bCs/>
+          <w:sz w:val="28"/>
+          <w:szCs w:val="28"/>
+        </w:rPr>
+        <w:t xml:space="preserve">Посилання на </w:t>
+      </w:r>
+      <w:r>
+        <w:rPr>
+          <w:rFonts w:ascii="Times New Roman" w:hAnsi="Times New Roman" w:cs="Times New Roman"/>
+          <w:b/>
+          <w:bCs/>
+          <w:sz w:val="28"/>
+          <w:szCs w:val="28"/>
+          <w:lang w:val="en-US"/>
+        </w:rPr>
+        <w:t xml:space="preserve">GitHub: </w:t>
+      </w:r>
+      <w:hyperlink r:id="rId19" w:history="1">
+        <w:proofErr w:type="spellStart"/>
+        <w:r>
+          <w:rPr>
+            <w:rStyle w:val="af"/>
+            <w:rFonts w:ascii="Times New Roman" w:hAnsi="Times New Roman" w:cs="Times New Roman"/>
+          </w:rPr>
+          <w:t>Vytrykushaa</w:t>
+        </w:r>
+        <w:proofErr w:type="spellEnd"/>
+        <w:r>
+          <w:rPr>
+            <w:rStyle w:val="af"/>
+            <w:rFonts w:ascii="Times New Roman" w:hAnsi="Times New Roman" w:cs="Times New Roman"/>
+          </w:rPr>
+          <w:t>/</w:t>
+        </w:r>
+        <w:proofErr w:type="spellStart"/>
+        <w:r>
+          <w:rPr>
+            <w:rStyle w:val="af"/>
+            <w:rFonts w:ascii="Times New Roman" w:hAnsi="Times New Roman" w:cs="Times New Roman"/>
+          </w:rPr>
+          <w:t>test-automation-labs</w:t>
+        </w:r>
+        <w:proofErr w:type="spellEnd"/>
+        <w:r>
+          <w:rPr>
+            <w:rStyle w:val="af"/>
+            <w:rFonts w:ascii="Times New Roman" w:hAnsi="Times New Roman" w:cs="Times New Roman"/>
+          </w:rPr>
+          <w:t>: Лабораторні роботи з Основ автоматизованого тестування</w:t>
+        </w:r>
+      </w:hyperlink>
     </w:p>
     <w:p>
       <w:pPr>

</xml_diff>